<commit_message>
[style] Add store info at header of pdf file
Still can not change this fk font, maai gaddddddddddddddddddddddddddddddddddddddddddddddddddddddddd
</commit_message>
<xml_diff>
--- a/Example_pdf.docx
+++ b/Example_pdf.docx
@@ -4,7 +4,7 @@
   <w:body>
     <w:tbl>
       <w:tblPr>
-        <w:tblW w:w="5000" w:type="pct"/>
+        <w:tblW w:w="9695" w:type="dxa"/>
         <w:jc w:val="left"/>
         <w:tblInd w:w="0" w:type="dxa"/>
         <w:tblLayout w:type="fixed"/>
@@ -16,39 +16,35 @@
         </w:tblCellMar>
       </w:tblPr>
       <w:tblGrid>
-        <w:gridCol w:w="4820"/>
-        <w:gridCol w:w="4821"/>
+        <w:gridCol w:w="4818"/>
+        <w:gridCol w:w="4877"/>
       </w:tblGrid>
       <w:tr>
         <w:trPr/>
         <w:tc>
           <w:tcPr>
-            <w:tcW w:w="4820" w:type="dxa"/>
+            <w:tcW w:w="4818" w:type="dxa"/>
             <w:tcBorders/>
           </w:tcPr>
           <w:p>
             <w:pPr>
               <w:pStyle w:val="TableContents"/>
+              <w:widowControl w:val="false"/>
               <w:bidi w:val="0"/>
               <w:spacing w:lineRule="auto" w:line="360"/>
               <w:jc w:val="left"/>
               <w:rPr>
-                <w:rFonts w:ascii="DejaVu Serif" w:hAnsi="DejaVu Serif"/>
-                <w:b/>
+                <w:rFonts w:ascii="Lora" w:hAnsi="Lora"/>
+              </w:rPr>
+            </w:pPr>
+            <w:r>
+              <w:rPr>
+                <w:rFonts w:ascii="Lora" w:hAnsi="Lora"/>
                 <w:b/>
                 <w:bCs/>
                 <w:sz w:val="28"/>
                 <w:szCs w:val="28"/>
               </w:rPr>
-            </w:pPr>
-            <w:r>
-              <w:rPr>
-                <w:rFonts w:ascii="DejaVu Serif" w:hAnsi="DejaVu Serif"/>
-                <w:b/>
-                <w:bCs/>
-                <w:sz w:val="28"/>
-                <w:szCs w:val="28"/>
-              </w:rPr>
               <w:t>Cửa hàng vật tư nông nghiệp</w:t>
               <w:br/>
               <w:t>Nam Khang</w:t>
@@ -57,16 +53,17 @@
           <w:p>
             <w:pPr>
               <w:pStyle w:val="TableContents"/>
+              <w:widowControl w:val="false"/>
               <w:bidi w:val="0"/>
               <w:spacing w:lineRule="auto" w:line="360"/>
               <w:jc w:val="left"/>
               <w:rPr>
-                <w:rFonts w:ascii="DejaVu Serif" w:hAnsi="DejaVu Serif"/>
-              </w:rPr>
-            </w:pPr>
-            <w:r>
-              <w:rPr>
-                <w:rFonts w:ascii="DejaVu Serif" w:hAnsi="DejaVu Serif"/>
+                <w:rFonts w:ascii="Lora" w:hAnsi="Lora"/>
+              </w:rPr>
+            </w:pPr>
+            <w:r>
+              <w:rPr>
+                <w:rFonts w:ascii="Lora" w:hAnsi="Lora"/>
                 <w:b/>
                 <w:bCs/>
               </w:rPr>
@@ -74,7 +71,7 @@
             </w:r>
             <w:r>
               <w:rPr>
-                <w:rFonts w:ascii="DejaVu Serif" w:hAnsi="DejaVu Serif"/>
+                <w:rFonts w:ascii="Lora" w:hAnsi="Lora"/>
               </w:rPr>
               <w:t>: 755 Nguyễn Văn Linh, ấp Năm Trại, xã Trường Đông, huyện Hòa Thành Tây Ninh.</w:t>
             </w:r>
@@ -82,16 +79,17 @@
           <w:p>
             <w:pPr>
               <w:pStyle w:val="TableContents"/>
+              <w:widowControl w:val="false"/>
               <w:bidi w:val="0"/>
               <w:spacing w:lineRule="auto" w:line="360"/>
               <w:jc w:val="left"/>
               <w:rPr>
-                <w:rFonts w:ascii="DejaVu Serif" w:hAnsi="DejaVu Serif"/>
-              </w:rPr>
-            </w:pPr>
-            <w:r>
-              <w:rPr>
-                <w:rFonts w:ascii="DejaVu Serif" w:hAnsi="DejaVu Serif"/>
+                <w:rFonts w:ascii="Lora" w:hAnsi="Lora"/>
+              </w:rPr>
+            </w:pPr>
+            <w:r>
+              <w:rPr>
+                <w:rFonts w:ascii="Lora" w:hAnsi="Lora"/>
                 <w:b/>
                 <w:bCs/>
               </w:rPr>
@@ -99,30 +97,31 @@
             </w:r>
             <w:r>
               <w:rPr>
-                <w:rFonts w:ascii="DejaVu Serif" w:hAnsi="DejaVu Serif"/>
-              </w:rPr>
-              <w:t>: 0948381573/ 0984012265</w:t>
+                <w:rFonts w:ascii="Lora" w:hAnsi="Lora"/>
+              </w:rPr>
+              <w:t>: 0948381573, 0984012265</w:t>
             </w:r>
           </w:p>
         </w:tc>
         <w:tc>
           <w:tcPr>
-            <w:tcW w:w="4821" w:type="dxa"/>
+            <w:tcW w:w="4877" w:type="dxa"/>
             <w:tcBorders/>
           </w:tcPr>
           <w:p>
             <w:pPr>
               <w:pStyle w:val="TableContents"/>
+              <w:widowControl w:val="false"/>
               <w:bidi w:val="0"/>
               <w:spacing w:lineRule="auto" w:line="360"/>
               <w:jc w:val="right"/>
               <w:rPr>
-                <w:rFonts w:ascii="DejaVu Serif" w:hAnsi="DejaVu Serif"/>
-              </w:rPr>
-            </w:pPr>
-            <w:r>
-              <w:rPr>
-                <w:rFonts w:ascii="DejaVu Serif" w:hAnsi="DejaVu Serif"/>
+                <w:rFonts w:ascii="Lora" w:hAnsi="Lora"/>
+              </w:rPr>
+            </w:pPr>
+            <w:r>
+              <w:rPr>
+                <w:rFonts w:ascii="Lora" w:hAnsi="Lora"/>
               </w:rPr>
               <w:t>Tên khách hàng:</w:t>
             </w:r>
@@ -130,16 +129,17 @@
           <w:p>
             <w:pPr>
               <w:pStyle w:val="TableContents"/>
+              <w:widowControl w:val="false"/>
               <w:bidi w:val="0"/>
               <w:spacing w:lineRule="auto" w:line="360"/>
               <w:jc w:val="right"/>
               <w:rPr>
-                <w:rFonts w:ascii="DejaVu Serif" w:hAnsi="DejaVu Serif"/>
-              </w:rPr>
-            </w:pPr>
-            <w:r>
-              <w:rPr>
-                <w:rFonts w:ascii="DejaVu Serif" w:hAnsi="DejaVu Serif"/>
+                <w:rFonts w:ascii="Lora" w:hAnsi="Lora"/>
+              </w:rPr>
+            </w:pPr>
+            <w:r>
+              <w:rPr>
+                <w:rFonts w:ascii="Lora" w:hAnsi="Lora"/>
               </w:rPr>
               <w:t>Mã sổ:</w:t>
             </w:r>
@@ -147,16 +147,17 @@
           <w:p>
             <w:pPr>
               <w:pStyle w:val="TableContents"/>
+              <w:widowControl w:val="false"/>
               <w:bidi w:val="0"/>
               <w:spacing w:lineRule="auto" w:line="360"/>
               <w:jc w:val="right"/>
               <w:rPr>
-                <w:rFonts w:ascii="DejaVu Serif" w:hAnsi="DejaVu Serif"/>
-              </w:rPr>
-            </w:pPr>
-            <w:r>
-              <w:rPr>
-                <w:rFonts w:ascii="DejaVu Serif" w:hAnsi="DejaVu Serif"/>
+                <w:rFonts w:ascii="Lora" w:hAnsi="Lora"/>
+              </w:rPr>
+            </w:pPr>
+            <w:r>
+              <w:rPr>
+                <w:rFonts w:ascii="Lora" w:hAnsi="Lora"/>
               </w:rPr>
               <w:t>Địa chỉ:</w:t>
             </w:r>
@@ -164,16 +165,17 @@
           <w:p>
             <w:pPr>
               <w:pStyle w:val="TableContents"/>
+              <w:widowControl w:val="false"/>
               <w:bidi w:val="0"/>
               <w:spacing w:lineRule="auto" w:line="360"/>
               <w:jc w:val="right"/>
               <w:rPr>
-                <w:rFonts w:ascii="DejaVu Serif" w:hAnsi="DejaVu Serif"/>
-              </w:rPr>
-            </w:pPr>
-            <w:r>
-              <w:rPr>
-                <w:rFonts w:ascii="DejaVu Serif" w:hAnsi="DejaVu Serif"/>
+                <w:rFonts w:ascii="Lora" w:hAnsi="Lora"/>
+              </w:rPr>
+            </w:pPr>
+            <w:r>
+              <w:rPr>
+                <w:rFonts w:ascii="Lora" w:hAnsi="Lora"/>
               </w:rPr>
               <w:t>Số điện thoại:</w:t>
             </w:r>
@@ -187,7 +189,7 @@
         <w:bidi w:val="0"/>
         <w:jc w:val="left"/>
         <w:rPr>
-          <w:rFonts w:ascii="DejaVu Serif" w:hAnsi="DejaVu Serif"/>
+          <w:rFonts w:ascii="Lora" w:hAnsi="Lora"/>
           <w:i w:val="false"/>
           <w:i w:val="false"/>
           <w:iCs w:val="false"/>
@@ -195,7 +197,7 @@
       </w:pPr>
       <w:r>
         <w:rPr>
-          <w:rFonts w:ascii="DejaVu Serif" w:hAnsi="DejaVu Serif"/>
+          <w:rFonts w:ascii="Lora" w:hAnsi="Lora"/>
           <w:i w:val="false"/>
           <w:iCs w:val="false"/>
         </w:rPr>
@@ -206,11 +208,13 @@
         <w:pStyle w:val="Title"/>
         <w:bidi w:val="0"/>
         <w:jc w:val="center"/>
-        <w:rPr/>
+        <w:rPr>
+          <w:rFonts w:ascii="Lora" w:hAnsi="Lora"/>
+        </w:rPr>
       </w:pPr>
       <w:r>
         <w:rPr>
-          <w:rFonts w:eastAsia="Noto Sans CJK SC" w:cs="FreeSans"/>
+          <w:rFonts w:eastAsia="Noto Sans CJK SC" w:cs="FreeSans" w:ascii="Lora" w:hAnsi="Lora"/>
           <w:b/>
           <w:bCs/>
           <w:sz w:val="56"/>
@@ -224,10 +228,14 @@
         <w:pStyle w:val="Normal"/>
         <w:bidi w:val="0"/>
         <w:jc w:val="left"/>
-        <w:rPr/>
+        <w:rPr>
+          <w:rFonts w:ascii="Lora" w:hAnsi="Lora"/>
+        </w:rPr>
       </w:pPr>
       <w:r>
-        <w:rPr/>
+        <w:rPr>
+          <w:rFonts w:ascii="Lora" w:hAnsi="Lora"/>
+        </w:rPr>
         <w:t>Ngày đáo hạn:</w:t>
       </w:r>
     </w:p>
@@ -236,10 +244,14 @@
         <w:pStyle w:val="Normal"/>
         <w:bidi w:val="0"/>
         <w:jc w:val="left"/>
-        <w:rPr/>
+        <w:rPr>
+          <w:rFonts w:ascii="Lora" w:hAnsi="Lora"/>
+        </w:rPr>
       </w:pPr>
       <w:r>
-        <w:rPr/>
+        <w:rPr>
+          <w:rFonts w:ascii="Lora" w:hAnsi="Lora"/>
+        </w:rPr>
         <w:t>Lãi suất hàng tháng:</w:t>
       </w:r>
     </w:p>
@@ -248,15 +260,19 @@
         <w:pStyle w:val="Normal"/>
         <w:bidi w:val="0"/>
         <w:jc w:val="left"/>
-        <w:rPr/>
+        <w:rPr>
+          <w:rFonts w:ascii="Lora" w:hAnsi="Lora"/>
+        </w:rPr>
       </w:pPr>
       <w:r>
-        <w:rPr/>
+        <w:rPr>
+          <w:rFonts w:ascii="Lora" w:hAnsi="Lora"/>
+        </w:rPr>
       </w:r>
     </w:p>
     <w:sectPr>
       <w:type w:val="nextPage"/>
-      <w:pgSz w:w="11909" w:h="16834"/>
+      <w:pgSz w:w="11906" w:h="16838"/>
       <w:pgMar w:left="1134" w:right="1134" w:gutter="0" w:header="0" w:top="1134" w:footer="0" w:bottom="1134"/>
       <w:pgNumType w:fmt="decimal"/>
       <w:formProt w:val="false"/>
@@ -281,7 +297,6 @@
     </w:rPrDefault>
     <w:pPrDefault>
       <w:pPr>
-        <w:widowControl/>
         <w:suppressAutoHyphens w:val="true"/>
       </w:pPr>
     </w:pPrDefault>
@@ -291,10 +306,11 @@
     <w:qFormat/>
     <w:pPr>
       <w:widowControl/>
-      <w:kinsoku w:val="true"/>
-      <w:overflowPunct w:val="true"/>
-      <w:autoSpaceDE w:val="true"/>
+      <w:suppressAutoHyphens w:val="true"/>
+      <w:overflowPunct w:val="false"/>
       <w:bidi w:val="0"/>
+      <w:spacing w:before="0" w:after="0"/>
+      <w:jc w:val="left"/>
     </w:pPr>
     <w:rPr>
       <w:rFonts w:ascii="Liberation Serif" w:hAnsi="Liberation Serif" w:eastAsia="Noto Serif CJK SC" w:cs="FreeSans"/>

</xml_diff>